<commit_message>
feat: add putting pipeline project page, linkedin content, and repo cleanup
</commit_message>
<xml_diff>
--- a/resumes/general.docx
+++ b/resumes/general.docx
@@ -145,7 +145,7 @@
           <w:rFonts w:ascii="Calibri" w:hAnsi="Calibri"/>
           <w:sz w:val="20"/>
         </w:rPr>
-        <w:t>AWS (S3, Lambda, DMS, Kinesis, ECR), Azure, Snowflake, BigQuery</w:t>
+        <w:t>AWS (S3, Lambda, DMS, Kinesis, ECR), Azure (Functions, SQL), Snowflake, BigQuery</w:t>
       </w:r>
     </w:p>
     <w:p>
@@ -185,7 +185,7 @@
           <w:rFonts w:ascii="Calibri" w:hAnsi="Calibri"/>
           <w:sz w:val="20"/>
         </w:rPr>
-        <w:t>Power BI, Power Query, Excel, Azure Data Studio, dbt, Erwin Data Modeler</w:t>
+        <w:t>Power BI, Power Query, Power Automate, Excel, Azure Data Studio, dbt, Erwin Data Modeler</w:t>
       </w:r>
     </w:p>
     <w:p>
@@ -245,7 +245,7 @@
           <w:rFonts w:ascii="Calibri" w:hAnsi="Calibri"/>
           <w:sz w:val="20"/>
         </w:rPr>
-        <w:t>REST API consumption, deeply nested JSON flattening (Python, C#)</w:t>
+        <w:t>REST API consumption, deeply nested JSON flattening (Python, C#), SQLAlchemy</w:t>
       </w:r>
     </w:p>
     <w:p>
@@ -410,6 +410,20 @@
           <w:sz w:val="20"/>
         </w:rPr>
         <w:t>Engineered a production data pipeline integrating Tekla PowerFab APIs (C#) with Python ETL workflows and AWS S3, automating ingestion of fabrication metrics into SQL Server for a steel manufacturing client.</w:t>
+      </w:r>
+    </w:p>
+    <w:p>
+      <w:pPr>
+        <w:pStyle w:val="ListBullet"/>
+        <w:spacing w:after="40" w:before="0"/>
+        <w:ind w:left="360"/>
+      </w:pPr>
+      <w:r>
+        <w:rPr>
+          <w:rFonts w:ascii="Calibri" w:hAnsi="Calibri"/>
+          <w:sz w:val="20"/>
+        </w:rPr>
+        <w:t>Built a serverless ETL pipeline (Azure Functions, Python) extracting putting stroke data from Blast Motion's REST API, loading incrementally into Azure SQL via high-watermark pattern and idempotent upserts, with Power Automate mobile orchestration and Power BI dashboard tracking 9 stroke metrics.</w:t>
       </w:r>
     </w:p>
     <w:p>

</xml_diff>